<commit_message>
docs: archive job search project checkpoint
</commit_message>
<xml_diff>
--- a/docs/brd/phase-0-job-sourcing.docx
+++ b/docs/brd/phase-0-job-sourcing.docx
@@ -32,6 +32,72 @@
           <w:sz w:val="24"/>
           <w:sz-cs w:val="24"/>
         </w:rPr>
+        <w:t xml:space="preserve">## Project Pause Status</w:t>
+      </w:r>
+    </w:p>
+    <w:p>
+      <w:pPr/>
+      <w:r>
+        <w:rPr>
+          <w:rFonts w:ascii="Helvetica Light" w:hAnsi="Helvetica Light" w:cs="Helvetica Light"/>
+          <w:sz w:val="24"/>
+          <w:sz-cs w:val="24"/>
+        </w:rPr>
+        <w:t xml:space="preserve"/>
+      </w:r>
+    </w:p>
+    <w:p>
+      <w:pPr/>
+      <w:r>
+        <w:rPr>
+          <w:rFonts w:ascii="Helvetica Light" w:hAnsi="Helvetica Light" w:cs="Helvetica Light"/>
+          <w:sz w:val="24"/>
+          <w:sz-cs w:val="24"/>
+        </w:rPr>
+        <w:t xml:space="preserve">**Status:** paused / maintenance-only as of 2026-09-14 because the user has finished the current job search.</w:t>
+      </w:r>
+    </w:p>
+    <w:p>
+      <w:pPr/>
+      <w:r>
+        <w:rPr>
+          <w:rFonts w:ascii="Helvetica Light" w:hAnsi="Helvetica Light" w:cs="Helvetica Light"/>
+          <w:sz w:val="24"/>
+          <w:sz-cs w:val="24"/>
+        </w:rPr>
+        <w:t xml:space="preserve"/>
+      </w:r>
+    </w:p>
+    <w:p>
+      <w:pPr/>
+      <w:r>
+        <w:rPr>
+          <w:rFonts w:ascii="Helvetica Light" w:hAnsi="Helvetica Light" w:cs="Helvetica Light"/>
+          <w:sz w:val="24"/>
+          <w:sz-cs w:val="24"/>
+        </w:rPr>
+        <w:t xml:space="preserve">This document is the canonical current-state BRD for the repository at pause time. The app should be treated as a working local-first checkpoint that can be resumed for a future search. Future work should prioritize preservation, reproducibility, and low-risk maintenance over new feature expansion unless the project is explicitly restarted.</w:t>
+      </w:r>
+    </w:p>
+    <w:p>
+      <w:pPr/>
+      <w:r>
+        <w:rPr>
+          <w:rFonts w:ascii="Helvetica Light" w:hAnsi="Helvetica Light" w:cs="Helvetica Light"/>
+          <w:sz w:val="24"/>
+          <w:sz-cs w:val="24"/>
+        </w:rPr>
+        <w:t xml:space="preserve"/>
+      </w:r>
+    </w:p>
+    <w:p>
+      <w:pPr/>
+      <w:r>
+        <w:rPr>
+          <w:rFonts w:ascii="Helvetica Light" w:hAnsi="Helvetica Light" w:cs="Helvetica Light"/>
+          <w:sz w:val="24"/>
+          <w:sz-cs w:val="24"/>
+        </w:rPr>
         <w:t xml:space="preserve">## 1. Business Objective</w:t>
       </w:r>
     </w:p>
@@ -54,7 +120,7 @@
           <w:sz w:val="24"/>
           <w:sz-cs w:val="24"/>
         </w:rPr>
-        <w:t xml:space="preserve">Build the first version of a local-first job-search application that automatically pulls jobs from selected company career sites, normalizes them into a common schema, stores them, and displays them in a dashboard for manual review and later LLM-based scoring.</w:t>
+        <w:t xml:space="preserve">Build a local-first job-search application that pulls jobs from selected company career sites, normalizes them into a common schema, stores them in SQLite, and displays them in a dashboard for review, resume/profile management, and explicitly-triggered LLM fit rating.</w:t>
       </w:r>
     </w:p>
     <w:p>
@@ -131,7 +197,238 @@
           <w:sz w:val="24"/>
           <w:sz-cs w:val="24"/>
         </w:rPr>
-        <w:t xml:space="preserve">Phase 0 does **not** perform fit scoring, resume tailoring, or application submission. It creates the job data pipeline and review surface that later phases will use.</w:t>
+        <w:t xml:space="preserve">Phase 0 began as the ingestion/review surface. The current app has grown to include resume/profile upload, LLM profile extraction, deep LLM job rating, fast LLM pre-rating infrastructure, and rating comparison CLI tools. Resume tailoring and application submission remain out of scope.</w:t>
+      </w:r>
+    </w:p>
+    <w:p>
+      <w:pPr/>
+      <w:r>
+        <w:rPr>
+          <w:rFonts w:ascii="Helvetica Light" w:hAnsi="Helvetica Light" w:cs="Helvetica Light"/>
+          <w:sz w:val="24"/>
+          <w:sz-cs w:val="24"/>
+        </w:rPr>
+        <w:t xml:space="preserve"/>
+      </w:r>
+    </w:p>
+    <w:p>
+      <w:pPr/>
+      <w:r>
+        <w:rPr>
+          <w:rFonts w:ascii="Helvetica Light" w:hAnsi="Helvetica Light" w:cs="Helvetica Light"/>
+          <w:sz w:val="24"/>
+          <w:sz-cs w:val="24"/>
+        </w:rPr>
+        <w:t xml:space="preserve">## 1.1 Current Implementation Snapshot</w:t>
+      </w:r>
+    </w:p>
+    <w:p>
+      <w:pPr/>
+      <w:r>
+        <w:rPr>
+          <w:rFonts w:ascii="Helvetica Light" w:hAnsi="Helvetica Light" w:cs="Helvetica Light"/>
+          <w:sz w:val="24"/>
+          <w:sz-cs w:val="24"/>
+        </w:rPr>
+        <w:t xml:space="preserve"/>
+      </w:r>
+    </w:p>
+    <w:p>
+      <w:pPr/>
+      <w:r>
+        <w:rPr>
+          <w:rFonts w:ascii="Helvetica Light" w:hAnsi="Helvetica Light" w:cs="Helvetica Light"/>
+          <w:sz w:val="24"/>
+          <w:sz-cs w:val="24"/>
+        </w:rPr>
+        <w:t xml:space="preserve">Repository layout:</w:t>
+      </w:r>
+    </w:p>
+    <w:p>
+      <w:pPr/>
+      <w:r>
+        <w:rPr>
+          <w:rFonts w:ascii="Helvetica Light" w:hAnsi="Helvetica Light" w:cs="Helvetica Light"/>
+          <w:sz w:val="24"/>
+          <w:sz-cs w:val="24"/>
+        </w:rPr>
+        <w:t xml:space="preserve"/>
+      </w:r>
+    </w:p>
+    <w:p>
+      <w:pPr/>
+      <w:r>
+        <w:rPr>
+          <w:rFonts w:ascii="Helvetica Light" w:hAnsi="Helvetica Light" w:cs="Helvetica Light"/>
+          <w:sz w:val="24"/>
+          <w:sz-cs w:val="24"/>
+        </w:rPr>
+        <w:t xml:space="preserve">- `jobsearch/app.py`: single-file Python app containing environment loading, background jobs, connectors, SQLite migrations/data access, resume/profile/rating logic, dashboard rendering, HTTP handlers, and CLI commands.</w:t>
+      </w:r>
+    </w:p>
+    <w:p>
+      <w:pPr/>
+      <w:r>
+        <w:rPr>
+          <w:rFonts w:ascii="Helvetica Light" w:hAnsi="Helvetica Light" w:cs="Helvetica Light"/>
+          <w:sz w:val="24"/>
+          <w:sz-cs w:val="24"/>
+        </w:rPr>
+        <w:t xml:space="preserve">- `tests/test_phase0.py`: regression tests for ingestion, DB state transitions, dashboard rendering, LLM profile/rating flows, fast/deep rating, and model comparison helpers.</w:t>
+      </w:r>
+    </w:p>
+    <w:p>
+      <w:pPr/>
+      <w:r>
+        <w:rPr>
+          <w:rFonts w:ascii="Helvetica Light" w:hAnsi="Helvetica Light" w:cs="Helvetica Light"/>
+          <w:sz w:val="24"/>
+          <w:sz-cs w:val="24"/>
+        </w:rPr>
+        <w:t xml:space="preserve">- `data/jobs.sqlite`: local SQLite database.</w:t>
+      </w:r>
+    </w:p>
+    <w:p>
+      <w:pPr/>
+      <w:r>
+        <w:rPr>
+          <w:rFonts w:ascii="Helvetica Light" w:hAnsi="Helvetica Light" w:cs="Helvetica Light"/>
+          <w:sz w:val="24"/>
+          <w:sz-cs w:val="24"/>
+        </w:rPr>
+        <w:t xml:space="preserve">- `data/resumes/`: uploaded resume files.</w:t>
+      </w:r>
+    </w:p>
+    <w:p>
+      <w:pPr/>
+      <w:r>
+        <w:rPr>
+          <w:rFonts w:ascii="Helvetica Light" w:hAnsi="Helvetica Light" w:cs="Helvetica Light"/>
+          <w:sz w:val="24"/>
+          <w:sz-cs w:val="24"/>
+        </w:rPr>
+        <w:t xml:space="preserve">- `docs/brd/`: markdown and Word BRDs.</w:t>
+      </w:r>
+    </w:p>
+    <w:p>
+      <w:pPr/>
+      <w:r>
+        <w:rPr>
+          <w:rFonts w:ascii="Helvetica Light" w:hAnsi="Helvetica Light" w:cs="Helvetica Light"/>
+          <w:sz w:val="24"/>
+          <w:sz-cs w:val="24"/>
+        </w:rPr>
+        <w:t xml:space="preserve">- `.env`: gitignored local secrets/config. `.env.example` documents required variables.</w:t>
+      </w:r>
+    </w:p>
+    <w:p>
+      <w:pPr/>
+      <w:r>
+        <w:rPr>
+          <w:rFonts w:ascii="Helvetica Light" w:hAnsi="Helvetica Light" w:cs="Helvetica Light"/>
+          <w:sz w:val="24"/>
+          <w:sz-cs w:val="24"/>
+        </w:rPr>
+        <w:t xml:space="preserve"/>
+      </w:r>
+    </w:p>
+    <w:p>
+      <w:pPr/>
+      <w:r>
+        <w:rPr>
+          <w:rFonts w:ascii="Helvetica Light" w:hAnsi="Helvetica Light" w:cs="Helvetica Light"/>
+          <w:sz w:val="24"/>
+          <w:sz-cs w:val="24"/>
+        </w:rPr>
+        <w:t xml:space="preserve">Live local database state as of latest inspection on 2026-09-14:</w:t>
+      </w:r>
+    </w:p>
+    <w:p>
+      <w:pPr/>
+      <w:r>
+        <w:rPr>
+          <w:rFonts w:ascii="Helvetica Light" w:hAnsi="Helvetica Light" w:cs="Helvetica Light"/>
+          <w:sz w:val="24"/>
+          <w:sz-cs w:val="24"/>
+        </w:rPr>
+        <w:t xml:space="preserve"/>
+      </w:r>
+    </w:p>
+    <w:p>
+      <w:pPr/>
+      <w:r>
+        <w:rPr>
+          <w:rFonts w:ascii="Helvetica Light" w:hAnsi="Helvetica Light" w:cs="Helvetica Light"/>
+          <w:sz w:val="24"/>
+          <w:sz-cs w:val="24"/>
+        </w:rPr>
+        <w:t xml:space="preserve">- `jobs`: 6,417 rows.</w:t>
+      </w:r>
+    </w:p>
+    <w:p>
+      <w:pPr/>
+      <w:r>
+        <w:rPr>
+          <w:rFonts w:ascii="Helvetica Light" w:hAnsi="Helvetica Light" w:cs="Helvetica Light"/>
+          <w:sz w:val="24"/>
+          <w:sz-cs w:val="24"/>
+        </w:rPr>
+        <w:t xml:space="preserve">- `job_ratings`: 3,039 deep ratings, all stored with `model_name='gpt-4o-mini'`.</w:t>
+      </w:r>
+    </w:p>
+    <w:p>
+      <w:pPr/>
+      <w:r>
+        <w:rPr>
+          <w:rFonts w:ascii="Helvetica Light" w:hAnsi="Helvetica Light" w:cs="Helvetica Light"/>
+          <w:sz w:val="24"/>
+          <w:sz-cs w:val="24"/>
+        </w:rPr>
+        <w:t xml:space="preserve">- `job_fast_ratings`: 0 persisted rows.</w:t>
+      </w:r>
+    </w:p>
+    <w:p>
+      <w:pPr/>
+      <w:r>
+        <w:rPr>
+          <w:rFonts w:ascii="Helvetica Light" w:hAnsi="Helvetica Light" w:cs="Helvetica Light"/>
+          <w:sz w:val="24"/>
+          <w:sz-cs w:val="24"/>
+        </w:rPr>
+        <w:t xml:space="preserve">- `profile_extractions`: 8 rows, including 1 LLM profile extraction with `gpt-4o-mini`.</w:t>
+      </w:r>
+    </w:p>
+    <w:p>
+      <w:pPr/>
+      <w:r>
+        <w:rPr>
+          <w:rFonts w:ascii="Helvetica Light" w:hAnsi="Helvetica Light" w:cs="Helvetica Light"/>
+          <w:sz w:val="24"/>
+          <w:sz-cs w:val="24"/>
+        </w:rPr>
+        <w:t xml:space="preserve">- `resume_files`: 9 rows.</w:t>
+      </w:r>
+    </w:p>
+    <w:p>
+      <w:pPr/>
+      <w:r>
+        <w:rPr>
+          <w:rFonts w:ascii="Helvetica Light" w:hAnsi="Helvetica Light" w:cs="Helvetica Light"/>
+          <w:sz w:val="24"/>
+          <w:sz-cs w:val="24"/>
+        </w:rPr>
+        <w:t xml:space="preserve">- `job_fetch_runs`: 205 rows.</w:t>
+      </w:r>
+    </w:p>
+    <w:p>
+      <w:pPr/>
+      <w:r>
+        <w:rPr>
+          <w:rFonts w:ascii="Helvetica Light" w:hAnsi="Helvetica Light" w:cs="Helvetica Light"/>
+          <w:sz w:val="24"/>
+          <w:sz-cs w:val="24"/>
+        </w:rPr>
+        <w:t xml:space="preserve">- `job_ingestion_audits`: 164,535 rows.</w:t>
       </w:r>
     </w:p>
     <w:p>
@@ -483,17 +780,6 @@
           <w:sz w:val="24"/>
           <w:sz-cs w:val="24"/>
         </w:rPr>
-        <w:t xml:space="preserve">- LLM fit scoring.</w:t>
-      </w:r>
-    </w:p>
-    <w:p>
-      <w:pPr/>
-      <w:r>
-        <w:rPr>
-          <w:rFonts w:ascii="Helvetica Light" w:hAnsi="Helvetica Light" w:cs="Helvetica Light"/>
-          <w:sz w:val="24"/>
-          <w:sz-cs w:val="24"/>
-        </w:rPr>
         <w:t xml:space="preserve">- Resume tailoring.</w:t>
       </w:r>
     </w:p>
@@ -516,17 +802,6 @@
           <w:sz w:val="24"/>
           <w:sz-cs w:val="24"/>
         </w:rPr>
-        <w:t xml:space="preserve">- User profile/resume management.</w:t>
-      </w:r>
-    </w:p>
-    <w:p>
-      <w:pPr/>
-      <w:r>
-        <w:rPr>
-          <w:rFonts w:ascii="Helvetica Light" w:hAnsi="Helvetica Light" w:cs="Helvetica Light"/>
-          <w:sz w:val="24"/>
-          <w:sz-cs w:val="24"/>
-        </w:rPr>
         <w:t xml:space="preserve">- Browser automation or application submission.</w:t>
       </w:r>
     </w:p>
@@ -549,6 +824,17 @@
           <w:sz w:val="24"/>
           <w:sz-cs w:val="24"/>
         </w:rPr>
+        <w:t xml:space="preserve">- Making DeepSeek the dashboard fast-rating model before validation proves it is on par with `gpt-4o-mini` for recall-safe fast rating.</w:t>
+      </w:r>
+    </w:p>
+    <w:p>
+      <w:pPr/>
+      <w:r>
+        <w:rPr>
+          <w:rFonts w:ascii="Helvetica Light" w:hAnsi="Helvetica Light" w:cs="Helvetica Light"/>
+          <w:sz w:val="24"/>
+          <w:sz-cs w:val="24"/>
+        </w:rPr>
         <w:t xml:space="preserve"/>
       </w:r>
     </w:p>
@@ -1264,7 +1550,29 @@
           <w:sz w:val="24"/>
           <w:sz-cs w:val="24"/>
         </w:rPr>
-        <w:t xml:space="preserve">Fast mode was intentionally removed because lightweight listing-only records are not useful enough for fit review without full descriptions, and search mode is a clearer way to limit the job set. Only an unrestricted full refresh may mark unseen jobs as expired; limited and search refreshes are intentionally partial and must not expire jobs that are outside the fetched subset. Daily background refresh is a future scheduling option for slow full-detail Workday/NVIDIA runs, but is not part of this implementation.</w:t>
+        <w:t xml:space="preserve">Fast mode was intentionally removed because lightweight listing-only records are not useful enough for fit review without full descriptions, and search mode is a clearer way to limit the job set. Only an unrestricted full refresh may mark unseen jobs as expired; limited and search refreshes are intentionally partial and must not expire jobs that are outside the fetched subset.</w:t>
+      </w:r>
+    </w:p>
+    <w:p>
+      <w:pPr/>
+      <w:r>
+        <w:rPr>
+          <w:rFonts w:ascii="Helvetica Light" w:hAnsi="Helvetica Light" w:cs="Helvetica Light"/>
+          <w:sz w:val="24"/>
+          <w:sz-cs w:val="24"/>
+        </w:rPr>
+        <w:t xml:space="preserve"/>
+      </w:r>
+    </w:p>
+    <w:p>
+      <w:pPr/>
+      <w:r>
+        <w:rPr>
+          <w:rFonts w:ascii="Helvetica Light" w:hAnsi="Helvetica Light" w:cs="Helvetica Light"/>
+          <w:sz w:val="24"/>
+          <w:sz-cs w:val="24"/>
+        </w:rPr>
+        <w:t xml:space="preserve">A daily full refresh should be scheduled at 12:00 AM using the host scheduler/Hermes cron rather than hidden browser automation. The dashboard must make scheduled refreshes observable by showing the most recent refresh status per company from `job_fetch_runs`, including whether it succeeded or failed, start/finish timestamps displayed in local Pacific time for readability, counts found/created/updated/expired, and any error message. Manual refreshes may use the same status surface because both scheduled and manual refreshes write to `job_fetch_runs`. Persisted timestamps remain UTC/ISO strings; local-time conversion is display-only.</w:t>
       </w:r>
     </w:p>
     <w:p>
@@ -3013,6 +3321,490 @@
           <w:sz w:val="24"/>
           <w:sz-cs w:val="24"/>
         </w:rPr>
+        <w:t xml:space="preserve"/>
+      </w:r>
+    </w:p>
+    <w:p>
+      <w:pPr/>
+      <w:r>
+        <w:rPr>
+          <w:rFonts w:ascii="Helvetica Light" w:hAnsi="Helvetica Light" w:cs="Helvetica Light"/>
+          <w:sz w:val="24"/>
+          <w:sz-cs w:val="24"/>
+        </w:rPr>
+        <w:t xml:space="preserve">#### `job_ratings`</w:t>
+      </w:r>
+    </w:p>
+    <w:p>
+      <w:pPr/>
+      <w:r>
+        <w:rPr>
+          <w:rFonts w:ascii="Helvetica Light" w:hAnsi="Helvetica Light" w:cs="Helvetica Light"/>
+          <w:sz w:val="24"/>
+          <w:sz-cs w:val="24"/>
+        </w:rPr>
+        <w:t xml:space="preserve"/>
+      </w:r>
+    </w:p>
+    <w:p>
+      <w:pPr/>
+      <w:r>
+        <w:rPr>
+          <w:rFonts w:ascii="Helvetica Light" w:hAnsi="Helvetica Light" w:cs="Helvetica Light"/>
+          <w:sz w:val="24"/>
+          <w:sz-cs w:val="24"/>
+        </w:rPr>
+        <w:t xml:space="preserve">Stores deep/full LLM ratings. Current persisted deep ratings use `model_name='gpt-4o-mini'`.</w:t>
+      </w:r>
+    </w:p>
+    <w:p>
+      <w:pPr/>
+      <w:r>
+        <w:rPr>
+          <w:rFonts w:ascii="Helvetica Light" w:hAnsi="Helvetica Light" w:cs="Helvetica Light"/>
+          <w:sz w:val="24"/>
+          <w:sz-cs w:val="24"/>
+        </w:rPr>
+        <w:t xml:space="preserve"/>
+      </w:r>
+    </w:p>
+    <w:p>
+      <w:pPr/>
+      <w:r>
+        <w:rPr>
+          <w:rFonts w:ascii="Helvetica Light" w:hAnsi="Helvetica Light" w:cs="Helvetica Light"/>
+          <w:sz w:val="24"/>
+          <w:sz-cs w:val="24"/>
+        </w:rPr>
+        <w:t xml:space="preserve">Fields:</w:t>
+      </w:r>
+    </w:p>
+    <w:p>
+      <w:pPr/>
+      <w:r>
+        <w:rPr>
+          <w:rFonts w:ascii="Helvetica Light" w:hAnsi="Helvetica Light" w:cs="Helvetica Light"/>
+          <w:sz w:val="24"/>
+          <w:sz-cs w:val="24"/>
+        </w:rPr>
+        <w:t xml:space="preserve"/>
+      </w:r>
+    </w:p>
+    <w:p>
+      <w:pPr/>
+      <w:r>
+        <w:rPr>
+          <w:rFonts w:ascii="Helvetica Light" w:hAnsi="Helvetica Light" w:cs="Helvetica Light"/>
+          <w:sz w:val="24"/>
+          <w:sz-cs w:val="24"/>
+        </w:rPr>
+        <w:t xml:space="preserve">- `id`</w:t>
+      </w:r>
+    </w:p>
+    <w:p>
+      <w:pPr/>
+      <w:r>
+        <w:rPr>
+          <w:rFonts w:ascii="Helvetica Light" w:hAnsi="Helvetica Light" w:cs="Helvetica Light"/>
+          <w:sz w:val="24"/>
+          <w:sz-cs w:val="24"/>
+        </w:rPr>
+        <w:t xml:space="preserve">- `job_id`</w:t>
+      </w:r>
+    </w:p>
+    <w:p>
+      <w:pPr/>
+      <w:r>
+        <w:rPr>
+          <w:rFonts w:ascii="Helvetica Light" w:hAnsi="Helvetica Light" w:cs="Helvetica Light"/>
+          <w:sz w:val="24"/>
+          <w:sz-cs w:val="24"/>
+        </w:rPr>
+        <w:t xml:space="preserve">- `profile_extraction_id`</w:t>
+      </w:r>
+    </w:p>
+    <w:p>
+      <w:pPr/>
+      <w:r>
+        <w:rPr>
+          <w:rFonts w:ascii="Helvetica Light" w:hAnsi="Helvetica Light" w:cs="Helvetica Light"/>
+          <w:sz w:val="24"/>
+          <w:sz-cs w:val="24"/>
+        </w:rPr>
+        <w:t xml:space="preserve">- `profile_hash`</w:t>
+      </w:r>
+    </w:p>
+    <w:p>
+      <w:pPr/>
+      <w:r>
+        <w:rPr>
+          <w:rFonts w:ascii="Helvetica Light" w:hAnsi="Helvetica Light" w:cs="Helvetica Light"/>
+          <w:sz w:val="24"/>
+          <w:sz-cs w:val="24"/>
+        </w:rPr>
+        <w:t xml:space="preserve">- `job_content_hash`</w:t>
+      </w:r>
+    </w:p>
+    <w:p>
+      <w:pPr/>
+      <w:r>
+        <w:rPr>
+          <w:rFonts w:ascii="Helvetica Light" w:hAnsi="Helvetica Light" w:cs="Helvetica Light"/>
+          <w:sz w:val="24"/>
+          <w:sz-cs w:val="24"/>
+        </w:rPr>
+        <w:t xml:space="preserve">- `rubric_version`</w:t>
+      </w:r>
+    </w:p>
+    <w:p>
+      <w:pPr/>
+      <w:r>
+        <w:rPr>
+          <w:rFonts w:ascii="Helvetica Light" w:hAnsi="Helvetica Light" w:cs="Helvetica Light"/>
+          <w:sz w:val="24"/>
+          <w:sz-cs w:val="24"/>
+        </w:rPr>
+        <w:t xml:space="preserve">- `rater_version`</w:t>
+      </w:r>
+    </w:p>
+    <w:p>
+      <w:pPr/>
+      <w:r>
+        <w:rPr>
+          <w:rFonts w:ascii="Helvetica Light" w:hAnsi="Helvetica Light" w:cs="Helvetica Light"/>
+          <w:sz w:val="24"/>
+          <w:sz-cs w:val="24"/>
+        </w:rPr>
+        <w:t xml:space="preserve">- `model_name`</w:t>
+      </w:r>
+    </w:p>
+    <w:p>
+      <w:pPr/>
+      <w:r>
+        <w:rPr>
+          <w:rFonts w:ascii="Helvetica Light" w:hAnsi="Helvetica Light" w:cs="Helvetica Light"/>
+          <w:sz w:val="24"/>
+          <w:sz-cs w:val="24"/>
+        </w:rPr>
+        <w:t xml:space="preserve">- `overall_score`</w:t>
+      </w:r>
+    </w:p>
+    <w:p>
+      <w:pPr/>
+      <w:r>
+        <w:rPr>
+          <w:rFonts w:ascii="Helvetica Light" w:hAnsi="Helvetica Light" w:cs="Helvetica Light"/>
+          <w:sz w:val="24"/>
+          <w:sz-cs w:val="24"/>
+        </w:rPr>
+        <w:t xml:space="preserve">- `skill_fit_score`</w:t>
+      </w:r>
+    </w:p>
+    <w:p>
+      <w:pPr/>
+      <w:r>
+        <w:rPr>
+          <w:rFonts w:ascii="Helvetica Light" w:hAnsi="Helvetica Light" w:cs="Helvetica Light"/>
+          <w:sz w:val="24"/>
+          <w:sz-cs w:val="24"/>
+        </w:rPr>
+        <w:t xml:space="preserve">- `practical_fit_score`</w:t>
+      </w:r>
+    </w:p>
+    <w:p>
+      <w:pPr/>
+      <w:r>
+        <w:rPr>
+          <w:rFonts w:ascii="Helvetica Light" w:hAnsi="Helvetica Light" w:cs="Helvetica Light"/>
+          <w:sz w:val="24"/>
+          <w:sz-cs w:val="24"/>
+        </w:rPr>
+        <w:t xml:space="preserve">- `recommendation`</w:t>
+      </w:r>
+    </w:p>
+    <w:p>
+      <w:pPr/>
+      <w:r>
+        <w:rPr>
+          <w:rFonts w:ascii="Helvetica Light" w:hAnsi="Helvetica Light" w:cs="Helvetica Light"/>
+          <w:sz w:val="24"/>
+          <w:sz-cs w:val="24"/>
+        </w:rPr>
+        <w:t xml:space="preserve">- `rating_json`</w:t>
+      </w:r>
+    </w:p>
+    <w:p>
+      <w:pPr/>
+      <w:r>
+        <w:rPr>
+          <w:rFonts w:ascii="Helvetica Light" w:hAnsi="Helvetica Light" w:cs="Helvetica Light"/>
+          <w:sz w:val="24"/>
+          <w:sz-cs w:val="24"/>
+        </w:rPr>
+        <w:t xml:space="preserve">- `is_current`</w:t>
+      </w:r>
+    </w:p>
+    <w:p>
+      <w:pPr/>
+      <w:r>
+        <w:rPr>
+          <w:rFonts w:ascii="Helvetica Light" w:hAnsi="Helvetica Light" w:cs="Helvetica Light"/>
+          <w:sz w:val="24"/>
+          <w:sz-cs w:val="24"/>
+        </w:rPr>
+        <w:t xml:space="preserve">- `created_at`</w:t>
+      </w:r>
+    </w:p>
+    <w:p>
+      <w:pPr/>
+      <w:r>
+        <w:rPr>
+          <w:rFonts w:ascii="Helvetica Light" w:hAnsi="Helvetica Light" w:cs="Helvetica Light"/>
+          <w:sz w:val="24"/>
+          <w:sz-cs w:val="24"/>
+        </w:rPr>
+        <w:t xml:space="preserve"/>
+      </w:r>
+    </w:p>
+    <w:p>
+      <w:pPr/>
+      <w:r>
+        <w:rPr>
+          <w:rFonts w:ascii="Helvetica Light" w:hAnsi="Helvetica Light" w:cs="Helvetica Light"/>
+          <w:sz w:val="24"/>
+          <w:sz-cs w:val="24"/>
+        </w:rPr>
+        <w:t xml:space="preserve">#### `job_fast_ratings`</w:t>
+      </w:r>
+    </w:p>
+    <w:p>
+      <w:pPr/>
+      <w:r>
+        <w:rPr>
+          <w:rFonts w:ascii="Helvetica Light" w:hAnsi="Helvetica Light" w:cs="Helvetica Light"/>
+          <w:sz w:val="24"/>
+          <w:sz-cs w:val="24"/>
+        </w:rPr>
+        <w:t xml:space="preserve"/>
+      </w:r>
+    </w:p>
+    <w:p>
+      <w:pPr/>
+      <w:r>
+        <w:rPr>
+          <w:rFonts w:ascii="Helvetica Light" w:hAnsi="Helvetica Light" w:cs="Helvetica Light"/>
+          <w:sz w:val="24"/>
+          <w:sz-cs w:val="24"/>
+        </w:rPr>
+        <w:t xml:space="preserve">Stores recall-heavy fast pre-rating results separately from deep ratings. No fast ratings are currently persisted in the live DB.</w:t>
+      </w:r>
+    </w:p>
+    <w:p>
+      <w:pPr/>
+      <w:r>
+        <w:rPr>
+          <w:rFonts w:ascii="Helvetica Light" w:hAnsi="Helvetica Light" w:cs="Helvetica Light"/>
+          <w:sz w:val="24"/>
+          <w:sz-cs w:val="24"/>
+        </w:rPr>
+        <w:t xml:space="preserve"/>
+      </w:r>
+    </w:p>
+    <w:p>
+      <w:pPr/>
+      <w:r>
+        <w:rPr>
+          <w:rFonts w:ascii="Helvetica Light" w:hAnsi="Helvetica Light" w:cs="Helvetica Light"/>
+          <w:sz w:val="24"/>
+          <w:sz-cs w:val="24"/>
+        </w:rPr>
+        <w:t xml:space="preserve">Fields:</w:t>
+      </w:r>
+    </w:p>
+    <w:p>
+      <w:pPr/>
+      <w:r>
+        <w:rPr>
+          <w:rFonts w:ascii="Helvetica Light" w:hAnsi="Helvetica Light" w:cs="Helvetica Light"/>
+          <w:sz w:val="24"/>
+          <w:sz-cs w:val="24"/>
+        </w:rPr>
+        <w:t xml:space="preserve"/>
+      </w:r>
+    </w:p>
+    <w:p>
+      <w:pPr/>
+      <w:r>
+        <w:rPr>
+          <w:rFonts w:ascii="Helvetica Light" w:hAnsi="Helvetica Light" w:cs="Helvetica Light"/>
+          <w:sz w:val="24"/>
+          <w:sz-cs w:val="24"/>
+        </w:rPr>
+        <w:t xml:space="preserve">- `id`</w:t>
+      </w:r>
+    </w:p>
+    <w:p>
+      <w:pPr/>
+      <w:r>
+        <w:rPr>
+          <w:rFonts w:ascii="Helvetica Light" w:hAnsi="Helvetica Light" w:cs="Helvetica Light"/>
+          <w:sz w:val="24"/>
+          <w:sz-cs w:val="24"/>
+        </w:rPr>
+        <w:t xml:space="preserve">- `job_id`</w:t>
+      </w:r>
+    </w:p>
+    <w:p>
+      <w:pPr/>
+      <w:r>
+        <w:rPr>
+          <w:rFonts w:ascii="Helvetica Light" w:hAnsi="Helvetica Light" w:cs="Helvetica Light"/>
+          <w:sz w:val="24"/>
+          <w:sz-cs w:val="24"/>
+        </w:rPr>
+        <w:t xml:space="preserve">- `profile_extraction_id`</w:t>
+      </w:r>
+    </w:p>
+    <w:p>
+      <w:pPr/>
+      <w:r>
+        <w:rPr>
+          <w:rFonts w:ascii="Helvetica Light" w:hAnsi="Helvetica Light" w:cs="Helvetica Light"/>
+          <w:sz w:val="24"/>
+          <w:sz-cs w:val="24"/>
+        </w:rPr>
+        <w:t xml:space="preserve">- `profile_hash`</w:t>
+      </w:r>
+    </w:p>
+    <w:p>
+      <w:pPr/>
+      <w:r>
+        <w:rPr>
+          <w:rFonts w:ascii="Helvetica Light" w:hAnsi="Helvetica Light" w:cs="Helvetica Light"/>
+          <w:sz w:val="24"/>
+          <w:sz-cs w:val="24"/>
+        </w:rPr>
+        <w:t xml:space="preserve">- `job_content_hash`</w:t>
+      </w:r>
+    </w:p>
+    <w:p>
+      <w:pPr/>
+      <w:r>
+        <w:rPr>
+          <w:rFonts w:ascii="Helvetica Light" w:hAnsi="Helvetica Light" w:cs="Helvetica Light"/>
+          <w:sz w:val="24"/>
+          <w:sz-cs w:val="24"/>
+        </w:rPr>
+        <w:t xml:space="preserve">- `rater_version`</w:t>
+      </w:r>
+    </w:p>
+    <w:p>
+      <w:pPr/>
+      <w:r>
+        <w:rPr>
+          <w:rFonts w:ascii="Helvetica Light" w:hAnsi="Helvetica Light" w:cs="Helvetica Light"/>
+          <w:sz w:val="24"/>
+          <w:sz-cs w:val="24"/>
+        </w:rPr>
+        <w:t xml:space="preserve">- `model_name`</w:t>
+      </w:r>
+    </w:p>
+    <w:p>
+      <w:pPr/>
+      <w:r>
+        <w:rPr>
+          <w:rFonts w:ascii="Helvetica Light" w:hAnsi="Helvetica Light" w:cs="Helvetica Light"/>
+          <w:sz w:val="24"/>
+          <w:sz-cs w:val="24"/>
+        </w:rPr>
+        <w:t xml:space="preserve">- `bucket` (`gte_7`, `lt_7`, `needs_manual_review`)</w:t>
+      </w:r>
+    </w:p>
+    <w:p>
+      <w:pPr/>
+      <w:r>
+        <w:rPr>
+          <w:rFonts w:ascii="Helvetica Light" w:hAnsi="Helvetica Light" w:cs="Helvetica Light"/>
+          <w:sz w:val="24"/>
+          <w:sz-cs w:val="24"/>
+        </w:rPr>
+        <w:t xml:space="preserve">- `confidence`</w:t>
+      </w:r>
+    </w:p>
+    <w:p>
+      <w:pPr/>
+      <w:r>
+        <w:rPr>
+          <w:rFonts w:ascii="Helvetica Light" w:hAnsi="Helvetica Light" w:cs="Helvetica Light"/>
+          <w:sz w:val="24"/>
+          <w:sz-cs w:val="24"/>
+        </w:rPr>
+        <w:t xml:space="preserve">- `reason_codes_json`</w:t>
+      </w:r>
+    </w:p>
+    <w:p>
+      <w:pPr/>
+      <w:r>
+        <w:rPr>
+          <w:rFonts w:ascii="Helvetica Light" w:hAnsi="Helvetica Light" w:cs="Helvetica Light"/>
+          <w:sz w:val="24"/>
+          <w:sz-cs w:val="24"/>
+        </w:rPr>
+        <w:t xml:space="preserve">- `short_reason`</w:t>
+      </w:r>
+    </w:p>
+    <w:p>
+      <w:pPr/>
+      <w:r>
+        <w:rPr>
+          <w:rFonts w:ascii="Helvetica Light" w:hAnsi="Helvetica Light" w:cs="Helvetica Light"/>
+          <w:sz w:val="24"/>
+          <w:sz-cs w:val="24"/>
+        </w:rPr>
+        <w:t xml:space="preserve">- `rating_json`</w:t>
+      </w:r>
+    </w:p>
+    <w:p>
+      <w:pPr/>
+      <w:r>
+        <w:rPr>
+          <w:rFonts w:ascii="Helvetica Light" w:hAnsi="Helvetica Light" w:cs="Helvetica Light"/>
+          <w:sz w:val="24"/>
+          <w:sz-cs w:val="24"/>
+        </w:rPr>
+        <w:t xml:space="preserve">- `is_current`</w:t>
+      </w:r>
+    </w:p>
+    <w:p>
+      <w:pPr/>
+      <w:r>
+        <w:rPr>
+          <w:rFonts w:ascii="Helvetica Light" w:hAnsi="Helvetica Light" w:cs="Helvetica Light"/>
+          <w:sz w:val="24"/>
+          <w:sz-cs w:val="24"/>
+        </w:rPr>
+        <w:t xml:space="preserve">- `created_at`</w:t>
+      </w:r>
+    </w:p>
+    <w:p>
+      <w:pPr/>
+      <w:r>
+        <w:rPr>
+          <w:rFonts w:ascii="Helvetica Light" w:hAnsi="Helvetica Light" w:cs="Helvetica Light"/>
+          <w:sz w:val="24"/>
+          <w:sz-cs w:val="24"/>
+        </w:rPr>
+        <w:t xml:space="preserve"/>
+      </w:r>
+    </w:p>
+    <w:p>
+      <w:pPr/>
+      <w:r>
+        <w:rPr>
+          <w:rFonts w:ascii="Helvetica Light" w:hAnsi="Helvetica Light" w:cs="Helvetica Light"/>
+          <w:sz w:val="24"/>
+          <w:sz-cs w:val="24"/>
+        </w:rPr>
         <w:t xml:space="preserve">## 6. Normalized Job Schema</w:t>
       </w:r>
     </w:p>
@@ -3739,6 +4531,72 @@
           <w:sz w:val="24"/>
           <w:sz-cs w:val="24"/>
         </w:rPr>
+        <w:t xml:space="preserve">The dashboard search/filter panel should include user-controlled sorting. Supported sort options should include newest first, oldest first, last seen recently, highest LLM fit score, company A-Z, and title A-Z. Sorting must preserve existing filters and pagination should reset to page 1 when changed from the filter form.</w:t>
+      </w:r>
+    </w:p>
+    <w:p>
+      <w:pPr/>
+      <w:r>
+        <w:rPr>
+          <w:rFonts w:ascii="Helvetica Light" w:hAnsi="Helvetica Light" w:cs="Helvetica Light"/>
+          <w:sz w:val="24"/>
+          <w:sz-cs w:val="24"/>
+        </w:rPr>
+        <w:t xml:space="preserve"/>
+      </w:r>
+    </w:p>
+    <w:p>
+      <w:pPr/>
+      <w:r>
+        <w:rPr>
+          <w:rFonts w:ascii="Helvetica Light" w:hAnsi="Helvetica Light" w:cs="Helvetica Light"/>
+          <w:sz w:val="24"/>
+          <w:sz-cs w:val="24"/>
+        </w:rPr>
+        <w:t xml:space="preserve">The main dashboard control areas should be ordered as collapsible panels: refresh jobs first, resume/profile upload and extraction second, search/filter saved jobs third, and LLM bulk rating last. Collapsed/open panel state should persist locally across page refreshes and filter submissions so panels the user collapsed do not automatically reopen. The unhide-all action belongs inside the search/filter panel next to the Filter button; it should be visually secondary/gray because it is a bulk visibility action, not the primary filter action.</w:t>
+      </w:r>
+    </w:p>
+    <w:p>
+      <w:pPr/>
+      <w:r>
+        <w:rPr>
+          <w:rFonts w:ascii="Helvetica Light" w:hAnsi="Helvetica Light" w:cs="Helvetica Light"/>
+          <w:sz w:val="24"/>
+          <w:sz-cs w:val="24"/>
+        </w:rPr>
+        <w:t xml:space="preserve"/>
+      </w:r>
+    </w:p>
+    <w:p>
+      <w:pPr/>
+      <w:r>
+        <w:rPr>
+          <w:rFonts w:ascii="Helvetica Light" w:hAnsi="Helvetica Light" w:cs="Helvetica Light"/>
+          <w:sz w:val="24"/>
+          <w:sz-cs w:val="24"/>
+        </w:rPr>
+        <w:t xml:space="preserve">Inline tooltip explanations should only appear when the user hovers or focuses the tooltip marker, rather than rendering long explanatory text directly in the dashboard layout.</w:t>
+      </w:r>
+    </w:p>
+    <w:p>
+      <w:pPr/>
+      <w:r>
+        <w:rPr>
+          <w:rFonts w:ascii="Helvetica Light" w:hAnsi="Helvetica Light" w:cs="Helvetica Light"/>
+          <w:sz w:val="24"/>
+          <w:sz-cs w:val="24"/>
+        </w:rPr>
+        <w:t xml:space="preserve"/>
+      </w:r>
+    </w:p>
+    <w:p>
+      <w:pPr/>
+      <w:r>
+        <w:rPr>
+          <w:rFonts w:ascii="Helvetica Light" w:hAnsi="Helvetica Light" w:cs="Helvetica Light"/>
+          <w:sz w:val="24"/>
+          <w:sz-cs w:val="24"/>
+        </w:rPr>
         <w:t xml:space="preserve">### Visual theme</w:t>
       </w:r>
     </w:p>
@@ -3970,95 +4828,106 @@
           <w:sz w:val="24"/>
           <w:sz-cs w:val="24"/>
         </w:rPr>
-        <w:t xml:space="preserve">The profile extractor should preserve structured evidence that can support ratings and tailoring:</w:t>
-      </w:r>
-    </w:p>
-    <w:p>
-      <w:pPr/>
-      <w:r>
-        <w:rPr>
-          <w:rFonts w:ascii="Helvetica Light" w:hAnsi="Helvetica Light" w:cs="Helvetica Light"/>
-          <w:sz w:val="24"/>
-          <w:sz-cs w:val="24"/>
-        </w:rPr>
-        <w:t xml:space="preserve"/>
-      </w:r>
-    </w:p>
-    <w:p>
-      <w:pPr/>
-      <w:r>
-        <w:rPr>
-          <w:rFonts w:ascii="Helvetica Light" w:hAnsi="Helvetica Light" w:cs="Helvetica Light"/>
-          <w:sz w:val="24"/>
-          <w:sz-cs w:val="24"/>
-        </w:rPr>
-        <w:t xml:space="preserve">- Target directions: tech supply chain, TPM, analytics, infrastructure, China/US/global exposure, and management track.</w:t>
-      </w:r>
-    </w:p>
-    <w:p>
-      <w:pPr/>
-      <w:r>
-        <w:rPr>
-          <w:rFonts w:ascii="Helvetica Light" w:hAnsi="Helvetica Light" w:cs="Helvetica Light"/>
-          <w:sz w:val="24"/>
-          <w:sz-cs w:val="24"/>
-        </w:rPr>
-        <w:t xml:space="preserve">- Strong proof points from the resume/reference: Google Control Tower, Tesla warehouse optimization, Industrial Engineering + MS Data Science, Enron ML, and Malema internship when present.</w:t>
-      </w:r>
-    </w:p>
-    <w:p>
-      <w:pPr/>
-      <w:r>
-        <w:rPr>
-          <w:rFonts w:ascii="Helvetica Light" w:hAnsi="Helvetica Light" w:cs="Helvetica Light"/>
-          <w:sz w:val="24"/>
-          <w:sz-cs w:val="24"/>
-        </w:rPr>
-        <w:t xml:space="preserve">- Domains/background: manufacturing, PCBA, supply chain, logistics, capacity, warehouse optimization, data analytics, forecasting, operations, quality/process/SOP work.</w:t>
-      </w:r>
-    </w:p>
-    <w:p>
-      <w:pPr/>
-      <w:r>
-        <w:rPr>
-          <w:rFonts w:ascii="Helvetica Light" w:hAnsi="Helvetica Light" w:cs="Helvetica Light"/>
-          <w:sz w:val="24"/>
-          <w:sz-cs w:val="24"/>
-        </w:rPr>
-        <w:t xml:space="preserve">- Tools/technical signals: SQL, Python, GCP, dashboards, optimization, ML, forecasting, BI tools, WMS/OMS, OR/analytics tooling.</w:t>
-      </w:r>
-    </w:p>
-    <w:p>
-      <w:pPr/>
-      <w:r>
-        <w:rPr>
-          <w:rFonts w:ascii="Helvetica Light" w:hAnsi="Helvetica Light" w:cs="Helvetica Light"/>
-          <w:sz w:val="24"/>
-          <w:sz-cs w:val="24"/>
-        </w:rPr>
-        <w:t xml:space="preserve">- Practical fit signals and blockers when available: internships/current-enrollment requirements, work authorization/location constraints, language requirements, years/seniority mismatches, and hard technical-lead requirements outside the resume evidence.</w:t>
-      </w:r>
-    </w:p>
-    <w:p>
-      <w:pPr/>
-      <w:r>
-        <w:rPr>
-          <w:rFonts w:ascii="Helvetica Light" w:hAnsi="Helvetica Light" w:cs="Helvetica Light"/>
-          <w:sz w:val="24"/>
-          <w:sz-cs w:val="24"/>
-        </w:rPr>
-        <w:t xml:space="preserve"/>
-      </w:r>
-    </w:p>
-    <w:p>
-      <w:pPr/>
-      <w:r>
-        <w:rPr>
-          <w:rFonts w:ascii="Helvetica Light" w:hAnsi="Helvetica Light" w:cs="Helvetica Light"/>
-          <w:sz w:val="24"/>
-          <w:sz-cs w:val="24"/>
-        </w:rPr>
-        <w:t xml:space="preserve">Fit scoring should return an overall 0-10 score plus category-level scores/reasons using these weights:</w:t>
+        <w:t xml:space="preserve">The profile extractor should preserve structured evidence that can support ratings and tailoring. These fields must be populated only from the current uploaded resume text and current LLM extraction result, not from hardcoded candidate assumptions:</w:t>
+      </w:r>
+    </w:p>
+    <w:p>
+      <w:pPr/>
+      <w:r>
+        <w:rPr>
+          <w:rFonts w:ascii="Helvetica Light" w:hAnsi="Helvetica Light" w:cs="Helvetica Light"/>
+          <w:sz w:val="24"/>
+          <w:sz-cs w:val="24"/>
+        </w:rPr>
+        <w:t xml:space="preserve"/>
+      </w:r>
+    </w:p>
+    <w:p>
+      <w:pPr/>
+      <w:r>
+        <w:rPr>
+          <w:rFonts w:ascii="Helvetica Light" w:hAnsi="Helvetica Light" w:cs="Helvetica Light"/>
+          <w:sz w:val="24"/>
+          <w:sz-cs w:val="24"/>
+        </w:rPr>
+        <w:t xml:space="preserve">- Target roles/directions extracted from the resume/profile.</w:t>
+      </w:r>
+    </w:p>
+    <w:p>
+      <w:pPr/>
+      <w:r>
+        <w:rPr>
+          <w:rFonts w:ascii="Helvetica Light" w:hAnsi="Helvetica Light" w:cs="Helvetica Light"/>
+          <w:sz w:val="24"/>
+          <w:sz-cs w:val="24"/>
+        </w:rPr>
+        <w:t xml:space="preserve">- Target industries/domains extracted from the resume/profile.</w:t>
+      </w:r>
+    </w:p>
+    <w:p>
+      <w:pPr/>
+      <w:r>
+        <w:rPr>
+          <w:rFonts w:ascii="Helvetica Light" w:hAnsi="Helvetica Light" w:cs="Helvetica Light"/>
+          <w:sz w:val="24"/>
+          <w:sz-cs w:val="24"/>
+        </w:rPr>
+        <w:t xml:space="preserve">- Technical/tool skills extracted from the resume/profile.</w:t>
+      </w:r>
+    </w:p>
+    <w:p>
+      <w:pPr/>
+      <w:r>
+        <w:rPr>
+          <w:rFonts w:ascii="Helvetica Light" w:hAnsi="Helvetica Light" w:cs="Helvetica Light"/>
+          <w:sz w:val="24"/>
+          <w:sz-cs w:val="24"/>
+        </w:rPr>
+        <w:t xml:space="preserve">- Core strengths and proof points extracted from the resume/profile.</w:t>
+      </w:r>
+    </w:p>
+    <w:p>
+      <w:pPr/>
+      <w:r>
+        <w:rPr>
+          <w:rFonts w:ascii="Helvetica Light" w:hAnsi="Helvetica Light" w:cs="Helvetica Light"/>
+          <w:sz w:val="24"/>
+          <w:sz-cs w:val="24"/>
+        </w:rPr>
+        <w:t xml:space="preserve">- Weaknesses, gaps, seniority, and practical constraints extracted from the resume/profile.</w:t>
+      </w:r>
+    </w:p>
+    <w:p>
+      <w:pPr/>
+      <w:r>
+        <w:rPr>
+          <w:rFonts w:ascii="Helvetica Light" w:hAnsi="Helvetica Light" w:cs="Helvetica Light"/>
+          <w:sz w:val="24"/>
+          <w:sz-cs w:val="24"/>
+        </w:rPr>
+        <w:t xml:space="preserve">- Resume bullet inventory/evidence extracted from the resume/profile.</w:t>
+      </w:r>
+    </w:p>
+    <w:p>
+      <w:pPr/>
+      <w:r>
+        <w:rPr>
+          <w:rFonts w:ascii="Helvetica Light" w:hAnsi="Helvetica Light" w:cs="Helvetica Light"/>
+          <w:sz w:val="24"/>
+          <w:sz-cs w:val="24"/>
+        </w:rPr>
+        <w:t xml:space="preserve"/>
+      </w:r>
+    </w:p>
+    <w:p>
+      <w:pPr/>
+      <w:r>
+        <w:rPr>
+          <w:rFonts w:ascii="Helvetica Light" w:hAnsi="Helvetica Light" w:cs="Helvetica Light"/>
+          <w:sz w:val="24"/>
+          <w:sz-cs w:val="24"/>
+        </w:rPr>
+        <w:t xml:space="preserve">Fit scoring should return an overall 0-10 score plus category-level scores/reasons using these weights. All category matching must compare the current job only against fields in the extracted profile JSON; rating code/prompts must not introduce hardcoded candidate roles, domains, companies, tools, proof points, or examples.</w:t>
       </w:r>
     </w:p>
     <w:p>
@@ -4102,73 +4971,73 @@
           <w:sz w:val="24"/>
           <w:sz-cs w:val="24"/>
         </w:rPr>
-        <w:t xml:space="preserve">| Core job-function match | 30% | Whether the job asks for work the user has done: analytics, planning, TPM, sourcing, logistics, ML, operations leadership, etc. |</w:t>
-      </w:r>
-    </w:p>
-    <w:p>
-      <w:pPr/>
-      <w:r>
-        <w:rPr>
-          <w:rFonts w:ascii="Helvetica Light" w:hAnsi="Helvetica Light" w:cs="Helvetica Light"/>
-          <w:sz w:val="24"/>
-          <w:sz-cs w:val="24"/>
-        </w:rPr>
-        <w:t xml:space="preserve">| Experience/seniority match | 20% | Whether years/seniority fit the user's 3+ years Accenture/Google + MSDS profile. |</w:t>
-      </w:r>
-    </w:p>
-    <w:p>
-      <w:pPr/>
-      <w:r>
-        <w:rPr>
-          <w:rFonts w:ascii="Helvetica Light" w:hAnsi="Helvetica Light" w:cs="Helvetica Light"/>
-          <w:sz w:val="24"/>
-          <w:sz-cs w:val="24"/>
-        </w:rPr>
-        <w:t xml:space="preserve">| Domain match | 15% | Whether the job connects to manufacturing, PCBA, supply chain, logistics, capacity, warehouse optimization, or data analytics. |</w:t>
-      </w:r>
-    </w:p>
-    <w:p>
-      <w:pPr/>
-      <w:r>
-        <w:rPr>
-          <w:rFonts w:ascii="Helvetica Light" w:hAnsi="Helvetica Light" w:cs="Helvetica Light"/>
-          <w:sz w:val="24"/>
-          <w:sz-cs w:val="24"/>
-        </w:rPr>
-        <w:t xml:space="preserve">| Technical/tool match | 15% | Match on SQL, Python, GCP, dashboards, optimization, ML, forecasting, BI tools, WMS/OMS, etc. |</w:t>
-      </w:r>
-    </w:p>
-    <w:p>
-      <w:pPr/>
-      <w:r>
-        <w:rPr>
-          <w:rFonts w:ascii="Helvetica Light" w:hAnsi="Helvetica Light" w:cs="Helvetica Light"/>
-          <w:sz w:val="24"/>
-          <w:sz-cs w:val="24"/>
-        </w:rPr>
-        <w:t xml:space="preserve">| Evidence strength from resume | 10% | Whether strong bullets/projects can prove the match, e.g. Google Control Tower, Tesla warehouse optimization, Enron ML, Malema internship. |</w:t>
-      </w:r>
-    </w:p>
-    <w:p>
-      <w:pPr/>
-      <w:r>
-        <w:rPr>
-          <w:rFonts w:ascii="Helvetica Light" w:hAnsi="Helvetica Light" w:cs="Helvetica Light"/>
-          <w:sz w:val="24"/>
-          <w:sz-cs w:val="24"/>
-        </w:rPr>
-        <w:t xml:space="preserve">| Gap severity | 5% | Whether gaps are small/trainable or hard blockers like Java backend tech lead, Japanese fluency, UK work authorization, or 10 years direct leadership. |</w:t>
-      </w:r>
-    </w:p>
-    <w:p>
-      <w:pPr/>
-      <w:r>
-        <w:rPr>
-          <w:rFonts w:ascii="Helvetica Light" w:hAnsi="Helvetica Light" w:cs="Helvetica Light"/>
-          <w:sz w:val="24"/>
-          <w:sz-cs w:val="24"/>
-        </w:rPr>
-        <w:t xml:space="preserve">| Strategic career value | 5% | Whether the role moves toward tech supply chain, TPM, analytics, infrastructure, China/US/global exposure, or management track. |</w:t>
+        <w:t xml:space="preserve">| Core job-function match | 30% | Whether the job asks for work represented in extracted target roles, strengths, skills, domains, and proof points. |</w:t>
+      </w:r>
+    </w:p>
+    <w:p>
+      <w:pPr/>
+      <w:r>
+        <w:rPr>
+          <w:rFonts w:ascii="Helvetica Light" w:hAnsi="Helvetica Light" w:cs="Helvetica Light"/>
+          <w:sz w:val="24"/>
+          <w:sz-cs w:val="24"/>
+        </w:rPr>
+        <w:t xml:space="preserve">| Experience/seniority match | 20% | Whether years/seniority requirements align with seniority evidence in the extracted profile. |</w:t>
+      </w:r>
+    </w:p>
+    <w:p>
+      <w:pPr/>
+      <w:r>
+        <w:rPr>
+          <w:rFonts w:ascii="Helvetica Light" w:hAnsi="Helvetica Light" w:cs="Helvetica Light"/>
+          <w:sz w:val="24"/>
+          <w:sz-cs w:val="24"/>
+        </w:rPr>
+        <w:t xml:space="preserve">| Domain match | 15% | Whether the job connects to extracted target industries/domains. |</w:t>
+      </w:r>
+    </w:p>
+    <w:p>
+      <w:pPr/>
+      <w:r>
+        <w:rPr>
+          <w:rFonts w:ascii="Helvetica Light" w:hAnsi="Helvetica Light" w:cs="Helvetica Light"/>
+          <w:sz w:val="24"/>
+          <w:sz-cs w:val="24"/>
+        </w:rPr>
+        <w:t xml:space="preserve">| Technical/tool match | 15% | Whether job requirements match extracted technical/tool skills. |</w:t>
+      </w:r>
+    </w:p>
+    <w:p>
+      <w:pPr/>
+      <w:r>
+        <w:rPr>
+          <w:rFonts w:ascii="Helvetica Light" w:hAnsi="Helvetica Light" w:cs="Helvetica Light"/>
+          <w:sz w:val="24"/>
+          <w:sz-cs w:val="24"/>
+        </w:rPr>
+        <w:t xml:space="preserve">| Evidence strength from resume | 10% | Whether extracted proof points or resume bullet inventory can prove the match. |</w:t>
+      </w:r>
+    </w:p>
+    <w:p>
+      <w:pPr/>
+      <w:r>
+        <w:rPr>
+          <w:rFonts w:ascii="Helvetica Light" w:hAnsi="Helvetica Light" w:cs="Helvetica Light"/>
+          <w:sz w:val="24"/>
+          <w:sz-cs w:val="24"/>
+        </w:rPr>
+        <w:t xml:space="preserve">| Gap severity | 5% | Whether extracted gaps/practical constraints conflict with job requirements. |</w:t>
+      </w:r>
+    </w:p>
+    <w:p>
+      <w:pPr/>
+      <w:r>
+        <w:rPr>
+          <w:rFonts w:ascii="Helvetica Light" w:hAnsi="Helvetica Light" w:cs="Helvetica Light"/>
+          <w:sz w:val="24"/>
+          <w:sz-cs w:val="24"/>
+        </w:rPr>
+        <w:t xml:space="preserve">| Strategic career value | 5% | Whether the role moves toward extracted target roles/directions. |</w:t>
       </w:r>
     </w:p>
     <w:p>
@@ -4333,7 +5202,18 @@
           <w:sz w:val="24"/>
           <w:sz-cs w:val="24"/>
         </w:rPr>
-        <w:t xml:space="preserve">- Add an OpenAI-compatible chat-completions client configured by environment variables: `JOBSEARCH_LLM_API_KEY` or `OPENAI_API_KEY`, optional `JOBSEARCH_LLM_BASE_URL`, and optional `JOBSEARCH_LLM_MODEL`. The local app should also auto-load a gitignored project-root `.env` file for these settings so the user can configure LLM features without exporting shell variables each launch.</w:t>
+        <w:t xml:space="preserve">- Add an OpenAI-compatible chat-completions client configured by environment variables: `JOBSEARCH_LLM_API_KEY` or `OPENAI_API_KEY`, optional `JOBSEARCH_LLM_BASE_URL`, and optional `JOBSEARCH_LLM_MODEL`. The app loads project-root `.env` first and then falls back to the Hermes `.env` for missing shared keys such as `OPENROUTER_API_KEY`.</w:t>
+      </w:r>
+    </w:p>
+    <w:p>
+      <w:pPr/>
+      <w:r>
+        <w:rPr>
+          <w:rFonts w:ascii="Helvetica Light" w:hAnsi="Helvetica Light" w:cs="Helvetica Light"/>
+          <w:sz w:val="24"/>
+          <w:sz-cs w:val="24"/>
+        </w:rPr>
+        <w:t xml:space="preserve">- Current local config has `JOBSEARCH_LLM_MODEL=gpt-4o-mini` and no `JOBSEARCH_LLM_BASE_URL`, so deep/profile/default rating calls go directly to OpenAI's `https://api.openai.com/v1/chat/completions` using `JOBSEARCH_LLM_API_KEY`, not OpenRouter.</w:t>
       </w:r>
     </w:p>
     <w:p>
@@ -4355,7 +5235,7 @@
           <w:sz w:val="24"/>
           <w:sz-cs w:val="24"/>
         </w:rPr>
-        <w:t xml:space="preserve">- LLM profile extraction input should include active resume extracted text plus the user's reference rubric. Output must be strict JSON following the profile schema, including candidate summary, target roles, target industries, seniority, core strengths, technical skills, domain skills, proof points, weaknesses/gaps, practical constraints, and resume bullet inventory.</w:t>
+        <w:t xml:space="preserve">- LLM profile extraction input should include active resume extracted text plus the profile/rating schema and generic 7-category rubric. Output must be strict JSON following the profile schema, including candidate summary, target roles, target industries, seniority, core strengths, technical skills, domain skills, proof points, weaknesses/gaps, practical constraints, and resume bullet inventory. The prompt/rubric must not include hardcoded candidate-specific roles, domains, companies, tools, proof points, or examples; these must come only from the uploaded resume text and extracted profile JSON.</w:t>
       </w:r>
     </w:p>
     <w:p>
@@ -4388,7 +5268,18 @@
           <w:sz w:val="24"/>
           <w:sz-cs w:val="24"/>
         </w:rPr>
-        <w:t xml:space="preserve">- The dashboard should expose `Rate this job with LLM` on job cards and job detail pages. Ratings should be manual; no automatic rating on refresh or page load.</w:t>
+        <w:t xml:space="preserve">- The dashboard should expose `Rate this job with LLM` on job detail pages. Ratings should be manual; no automatic rating on refresh or page load.</w:t>
+      </w:r>
+    </w:p>
+    <w:p>
+      <w:pPr/>
+      <w:r>
+        <w:rPr>
+          <w:rFonts w:ascii="Helvetica Light" w:hAnsi="Helvetica Light" w:cs="Helvetica Light"/>
+          <w:sz w:val="24"/>
+          <w:sz-cs w:val="24"/>
+        </w:rPr>
+        <w:t xml:space="preserve">- The dashboard should expose bulk LLM rating controls as explicit manual actions: `Rate all matching jobs with LLM` for the full current dashboard filter result set, and `Rate jobs on this page with LLM` for only the currently visible paginated rows. Both actions should run in the background, reuse cached current ratings when profile/job/model/rubric keys match, report queued/running/success/failure status on the dashboard, and avoid changing job source/review/saved/hidden states.</w:t>
       </w:r>
     </w:p>
     <w:p>
@@ -4443,7 +5334,348 @@
           <w:sz w:val="24"/>
           <w:sz-cs w:val="24"/>
         </w:rPr>
-        <w:t xml:space="preserve">- Token control: all LLM actions are explicit button clicks; single-job rating is synchronous for now, while profile extraction starts a background job and immediately redirects so the browser does not sit in loading mode during long LLM calls. Batch rating is out of scope until single-job flow is verified.</w:t>
+        <w:t xml:space="preserve">- Token control: all LLM actions are explicit button clicks. Profile extraction, deep bulk rating, and fast bulk rating run as background jobs and redirect immediately with visible status. Single-job deep rating remains manual from the job detail page.</w:t>
+      </w:r>
+    </w:p>
+    <w:p>
+      <w:pPr/>
+      <w:r>
+        <w:rPr>
+          <w:rFonts w:ascii="Helvetica Light" w:hAnsi="Helvetica Light" w:cs="Helvetica Light"/>
+          <w:sz w:val="24"/>
+          <w:sz-cs w:val="24"/>
+        </w:rPr>
+        <w:t xml:space="preserve"/>
+      </w:r>
+    </w:p>
+    <w:p>
+      <w:pPr/>
+      <w:r>
+        <w:rPr>
+          <w:rFonts w:ascii="Helvetica Light" w:hAnsi="Helvetica Light" w:cs="Helvetica Light"/>
+          <w:sz w:val="24"/>
+          <w:sz-cs w:val="24"/>
+        </w:rPr>
+        <w:t xml:space="preserve"/>
+      </w:r>
+    </w:p>
+    <w:p>
+      <w:pPr/>
+      <w:r>
+        <w:rPr>
+          <w:rFonts w:ascii="Helvetica Light" w:hAnsi="Helvetica Light" w:cs="Helvetica Light"/>
+          <w:sz w:val="24"/>
+          <w:sz-cs w:val="24"/>
+        </w:rPr>
+        <w:t xml:space="preserve"/>
+      </w:r>
+    </w:p>
+    <w:p>
+      <w:pPr/>
+      <w:r>
+        <w:rPr>
+          <w:rFonts w:ascii="Helvetica Light" w:hAnsi="Helvetica Light" w:cs="Helvetica Light"/>
+          <w:sz w:val="24"/>
+          <w:sz-cs w:val="24"/>
+        </w:rPr>
+        <w:t xml:space="preserve">### Fast/deep rating model validation</w:t>
+      </w:r>
+    </w:p>
+    <w:p>
+      <w:pPr/>
+      <w:r>
+        <w:rPr>
+          <w:rFonts w:ascii="Helvetica Light" w:hAnsi="Helvetica Light" w:cs="Helvetica Light"/>
+          <w:sz w:val="24"/>
+          <w:sz-cs w:val="24"/>
+        </w:rPr>
+        <w:t xml:space="preserve"/>
+      </w:r>
+    </w:p>
+    <w:p>
+      <w:pPr/>
+      <w:r>
+        <w:rPr>
+          <w:rFonts w:ascii="Helvetica Light" w:hAnsi="Helvetica Light" w:cs="Helvetica Light"/>
+          <w:sz w:val="24"/>
+          <w:sz-cs w:val="24"/>
+        </w:rPr>
+        <w:t xml:space="preserve">The product uses two rating concepts:</w:t>
+      </w:r>
+    </w:p>
+    <w:p>
+      <w:pPr/>
+      <w:r>
+        <w:rPr>
+          <w:rFonts w:ascii="Helvetica Light" w:hAnsi="Helvetica Light" w:cs="Helvetica Light"/>
+          <w:sz w:val="24"/>
+          <w:sz-cs w:val="24"/>
+        </w:rPr>
+        <w:t xml:space="preserve"/>
+      </w:r>
+    </w:p>
+    <w:p>
+      <w:pPr/>
+      <w:r>
+        <w:rPr>
+          <w:rFonts w:ascii="Helvetica Light" w:hAnsi="Helvetica Light" w:cs="Helvetica Light"/>
+          <w:sz w:val="24"/>
+          <w:sz-cs w:val="24"/>
+        </w:rPr>
+        <w:t xml:space="preserve">- **Deep/full rating:** rigorous 7-category score stored in `job_ratings`; currently defaults to `gpt-4o-mini` via `JOBSEARCH_LLM_MODEL`.</w:t>
+      </w:r>
+    </w:p>
+    <w:p>
+      <w:pPr/>
+      <w:r>
+        <w:rPr>
+          <w:rFonts w:ascii="Helvetica Light" w:hAnsi="Helvetica Light" w:cs="Helvetica Light"/>
+          <w:sz w:val="24"/>
+          <w:sz-cs w:val="24"/>
+        </w:rPr>
+        <w:t xml:space="preserve">- **Fast pre-rating:** recall-heavy triage into `gte_7`, `lt_7`, or `needs_manual_review`, stored in `job_fast_ratings` when persisted.</w:t>
+      </w:r>
+    </w:p>
+    <w:p>
+      <w:pPr/>
+      <w:r>
+        <w:rPr>
+          <w:rFonts w:ascii="Helvetica Light" w:hAnsi="Helvetica Light" w:cs="Helvetica Light"/>
+          <w:sz w:val="24"/>
+          <w:sz-cs w:val="24"/>
+        </w:rPr>
+        <w:t xml:space="preserve"/>
+      </w:r>
+    </w:p>
+    <w:p>
+      <w:pPr/>
+      <w:r>
+        <w:rPr>
+          <w:rFonts w:ascii="Helvetica Light" w:hAnsi="Helvetica Light" w:cs="Helvetica Light"/>
+          <w:sz w:val="24"/>
+          <w:sz-cs w:val="24"/>
+        </w:rPr>
+        <w:t xml:space="preserve">Model routing rules:</w:t>
+      </w:r>
+    </w:p>
+    <w:p>
+      <w:pPr/>
+      <w:r>
+        <w:rPr>
+          <w:rFonts w:ascii="Helvetica Light" w:hAnsi="Helvetica Light" w:cs="Helvetica Light"/>
+          <w:sz w:val="24"/>
+          <w:sz-cs w:val="24"/>
+        </w:rPr>
+        <w:t xml:space="preserve"/>
+      </w:r>
+    </w:p>
+    <w:p>
+      <w:pPr/>
+      <w:r>
+        <w:rPr>
+          <w:rFonts w:ascii="Helvetica Light" w:hAnsi="Helvetica Light" w:cs="Helvetica Light"/>
+          <w:sz w:val="24"/>
+          <w:sz-cs w:val="24"/>
+        </w:rPr>
+        <w:t xml:space="preserve">- Default fast and deep rating both resolve through `configured_llm_model()`: `JOBSEARCH_LLM_MODEL`, then `OPENAI_MODEL`, then default `gpt-4o-mini`.</w:t>
+      </w:r>
+    </w:p>
+    <w:p>
+      <w:pPr/>
+      <w:r>
+        <w:rPr>
+          <w:rFonts w:ascii="Helvetica Light" w:hAnsi="Helvetica Light" w:cs="Helvetica Light"/>
+          <w:sz w:val="24"/>
+          <w:sz-cs w:val="24"/>
+        </w:rPr>
+        <w:t xml:space="preserve">- DeepSeek is available only for explicit CLI benchmarking/comparison through `--fast-mode openrouter-v4-flash`, which uses `deepseek/deepseek-v4-flash` through OpenRouter with `OPENROUTER_API_KEY`.</w:t>
+      </w:r>
+    </w:p>
+    <w:p>
+      <w:pPr/>
+      <w:r>
+        <w:rPr>
+          <w:rFonts w:ascii="Helvetica Light" w:hAnsi="Helvetica Light" w:cs="Helvetica Light"/>
+          <w:sz w:val="24"/>
+          <w:sz-cs w:val="24"/>
+        </w:rPr>
+        <w:t xml:space="preserve">- DeepSeek must not be wired into the dashboard fast-rating controls until validation shows it is on par with `gpt-4o-mini`, especially on false-negative/recall safety.</w:t>
+      </w:r>
+    </w:p>
+    <w:p>
+      <w:pPr/>
+      <w:r>
+        <w:rPr>
+          <w:rFonts w:ascii="Helvetica Light" w:hAnsi="Helvetica Light" w:cs="Helvetica Light"/>
+          <w:sz w:val="24"/>
+          <w:sz-cs w:val="24"/>
+        </w:rPr>
+        <w:t xml:space="preserve">- Fast prompt version `llm-fast-rating-v5` adds DeepSeek/cheap-model guardrails against over-strict rejection, profile-agnostic examples, and a rule not to use `lt_7` for merely imperfect but plausibly relevant matches. It also routes stretch seniority, international/onsite location, work authorization/clearance/language concerns, customer-facing variants, unfamiliar title wording, missing specialized subdomain experience, and adjacent data/platform/operations roles to `needs_manual_review` when the profile has any transferable bridge. It must use the current extracted profile JSON, not hardcoded current-profile terms.</w:t>
+      </w:r>
+    </w:p>
+    <w:p>
+      <w:pPr/>
+      <w:r>
+        <w:rPr>
+          <w:rFonts w:ascii="Helvetica Light" w:hAnsi="Helvetica Light" w:cs="Helvetica Light"/>
+          <w:sz w:val="24"/>
+          <w:sz-cs w:val="24"/>
+        </w:rPr>
+        <w:t xml:space="preserve"/>
+      </w:r>
+    </w:p>
+    <w:p>
+      <w:pPr/>
+      <w:r>
+        <w:rPr>
+          <w:rFonts w:ascii="Helvetica Light" w:hAnsi="Helvetica Light" w:cs="Helvetica Light"/>
+          <w:sz w:val="24"/>
+          <w:sz-cs w:val="24"/>
+        </w:rPr>
+        <w:t xml:space="preserve">Validation commands:</w:t>
+      </w:r>
+    </w:p>
+    <w:p>
+      <w:pPr/>
+      <w:r>
+        <w:rPr>
+          <w:rFonts w:ascii="Helvetica Light" w:hAnsi="Helvetica Light" w:cs="Helvetica Light"/>
+          <w:sz w:val="24"/>
+          <w:sz-cs w:val="24"/>
+        </w:rPr>
+        <w:t xml:space="preserve"/>
+      </w:r>
+    </w:p>
+    <w:p>
+      <w:pPr/>
+      <w:r>
+        <w:rPr>
+          <w:rFonts w:ascii="Helvetica Light" w:hAnsi="Helvetica Light" w:cs="Helvetica Light"/>
+          <w:sz w:val="24"/>
+          <w:sz-cs w:val="24"/>
+        </w:rPr>
+        <w:t xml:space="preserve">```bash</w:t>
+      </w:r>
+    </w:p>
+    <w:p>
+      <w:pPr/>
+      <w:r>
+        <w:rPr>
+          <w:rFonts w:ascii="Helvetica Light" w:hAnsi="Helvetica Light" w:cs="Helvetica Light"/>
+          <w:sz w:val="24"/>
+          <w:sz-cs w:val="24"/>
+        </w:rPr>
+        <w:t xml:space="preserve">python3 -m jobsearch.app benchmark-fast-rating --sample-size 100 --fast-mode openrouter-v4-flash</w:t>
+      </w:r>
+    </w:p>
+    <w:p>
+      <w:pPr/>
+      <w:r>
+        <w:rPr>
+          <w:rFonts w:ascii="Helvetica Light" w:hAnsi="Helvetica Light" w:cs="Helvetica Light"/>
+          <w:sz w:val="24"/>
+          <w:sz-cs w:val="24"/>
+        </w:rPr>
+        <w:t xml:space="preserve">python3 -m jobsearch.app compare-fast-deep-rating --sample-size 100 --fast-mode openrouter-v4-flash</w:t>
+      </w:r>
+    </w:p>
+    <w:p>
+      <w:pPr/>
+      <w:r>
+        <w:rPr>
+          <w:rFonts w:ascii="Helvetica Light" w:hAnsi="Helvetica Light" w:cs="Helvetica Light"/>
+          <w:sz w:val="24"/>
+          <w:sz-cs w:val="24"/>
+        </w:rPr>
+        <w:t xml:space="preserve">python3 -m jobsearch.app compare-rating-models --sample-size 100</w:t>
+      </w:r>
+    </w:p>
+    <w:p>
+      <w:pPr/>
+      <w:r>
+        <w:rPr>
+          <w:rFonts w:ascii="Helvetica Light" w:hAnsi="Helvetica Light" w:cs="Helvetica Light"/>
+          <w:sz w:val="24"/>
+          <w:sz-cs w:val="24"/>
+        </w:rPr>
+        <w:t xml:space="preserve">```</w:t>
+      </w:r>
+    </w:p>
+    <w:p>
+      <w:pPr/>
+      <w:r>
+        <w:rPr>
+          <w:rFonts w:ascii="Helvetica Light" w:hAnsi="Helvetica Light" w:cs="Helvetica Light"/>
+          <w:sz w:val="24"/>
+          <w:sz-cs w:val="24"/>
+        </w:rPr>
+        <w:t xml:space="preserve"/>
+      </w:r>
+    </w:p>
+    <w:p>
+      <w:pPr/>
+      <w:r>
+        <w:rPr>
+          <w:rFonts w:ascii="Helvetica Light" w:hAnsi="Helvetica Light" w:cs="Helvetica Light"/>
+          <w:sz w:val="24"/>
+          <w:sz-cs w:val="24"/>
+        </w:rPr>
+        <w:t xml:space="preserve">Validation acceptance guidance:</w:t>
+      </w:r>
+    </w:p>
+    <w:p>
+      <w:pPr/>
+      <w:r>
+        <w:rPr>
+          <w:rFonts w:ascii="Helvetica Light" w:hAnsi="Helvetica Light" w:cs="Helvetica Light"/>
+          <w:sz w:val="24"/>
+          <w:sz-cs w:val="24"/>
+        </w:rPr>
+        <w:t xml:space="preserve"/>
+      </w:r>
+    </w:p>
+    <w:p>
+      <w:pPr/>
+      <w:r>
+        <w:rPr>
+          <w:rFonts w:ascii="Helvetica Light" w:hAnsi="Helvetica Light" w:cs="Helvetica Light"/>
+          <w:sz w:val="24"/>
+          <w:sz-cs w:val="24"/>
+        </w:rPr>
+        <w:t xml:space="preserve">- False negatives should be zero or extremely rare and explainable.</w:t>
+      </w:r>
+    </w:p>
+    <w:p>
+      <w:pPr/>
+      <w:r>
+        <w:rPr>
+          <w:rFonts w:ascii="Helvetica Light" w:hAnsi="Helvetica Light" w:cs="Helvetica Light"/>
+          <w:sz w:val="24"/>
+          <w:sz-cs w:val="24"/>
+        </w:rPr>
+        <w:t xml:space="preserve">- Recall on deep-rated `&gt;=7` jobs should be comparable to or better than `gpt-4o-mini` fast rating.</w:t>
+      </w:r>
+    </w:p>
+    <w:p>
+      <w:pPr/>
+      <w:r>
+        <w:rPr>
+          <w:rFonts w:ascii="Helvetica Light" w:hAnsi="Helvetica Light" w:cs="Helvetica Light"/>
+          <w:sz w:val="24"/>
+          <w:sz-cs w:val="24"/>
+        </w:rPr>
+        <w:t xml:space="preserve">- Higher false positives are acceptable because deep rating verifies promising jobs.</w:t>
+      </w:r>
+    </w:p>
+    <w:p>
+      <w:pPr/>
+      <w:r>
+        <w:rPr>
+          <w:rFonts w:ascii="Helvetica Light" w:hAnsi="Helvetica Light" w:cs="Helvetica Light"/>
+          <w:sz w:val="24"/>
+          <w:sz-cs w:val="24"/>
+        </w:rPr>
+        <w:t xml:space="preserve">- `needs_manual_review` is acceptable as an abstain bucket, but should not be so large that fast rating stops saving work.</w:t>
       </w:r>
     </w:p>
     <w:p>
@@ -4586,6 +5818,17 @@
           <w:sz w:val="24"/>
           <w:sz-cs w:val="24"/>
         </w:rPr>
+        <w:t xml:space="preserve">- Search/filter panel sort dropdown supports recommended/default, newest first, oldest first, last seen recently, highest LLM fit score, company A-Z, and title A-Z while preserving the active filters.</w:t>
+      </w:r>
+    </w:p>
+    <w:p>
+      <w:pPr/>
+      <w:r>
+        <w:rPr>
+          <w:rFonts w:ascii="Helvetica Light" w:hAnsi="Helvetica Light" w:cs="Helvetica Light"/>
+          <w:sz w:val="24"/>
+          <w:sz-cs w:val="24"/>
+        </w:rPr>
         <w:t xml:space="preserve">- Per-job hide/unhide action to remove individual jobs from the active review list or restore them without deleting the job record or applied-job history. Job cards and detail pages should show `Hide` for non-hidden jobs and `Unhide` for hidden jobs.</w:t>
       </w:r>
     </w:p>
@@ -4619,7 +5862,7 @@
           <w:sz w:val="24"/>
           <w:sz-cs w:val="24"/>
         </w:rPr>
-        <w:t xml:space="preserve">- Top-level `Unhide all jobs` action to restore all currently hidden jobs.</w:t>
+        <w:t xml:space="preserve">- Search/filter-panel `Unhide all jobs` action to restore all currently hidden jobs; it should appear to the left of the Filter button and use secondary/gray styling.</w:t>
       </w:r>
     </w:p>
     <w:p>
@@ -5070,6 +6313,39 @@
           <w:sz w:val="24"/>
           <w:sz-cs w:val="24"/>
         </w:rPr>
+        <w:t xml:space="preserve">- FR16: The system can run deep bulk rating in the background with progress counts and cached-rating reuse.</w:t>
+      </w:r>
+    </w:p>
+    <w:p>
+      <w:pPr/>
+      <w:r>
+        <w:rPr>
+          <w:rFonts w:ascii="Helvetica Light" w:hAnsi="Helvetica Light" w:cs="Helvetica Light"/>
+          <w:sz w:val="24"/>
+          <w:sz-cs w:val="24"/>
+        </w:rPr>
+        <w:t xml:space="preserve">- FR17: The system can run fast recall-heavy pre-rating separately from deep rating and derive rating-state filters without changing review/source/saved/hidden state.</w:t>
+      </w:r>
+    </w:p>
+    <w:p>
+      <w:pPr/>
+      <w:r>
+        <w:rPr>
+          <w:rFonts w:ascii="Helvetica Light" w:hAnsi="Helvetica Light" w:cs="Helvetica Light"/>
+          <w:sz w:val="24"/>
+          <w:sz-cs w:val="24"/>
+        </w:rPr>
+        <w:t xml:space="preserve">- FR18: The CLI can benchmark default fast rating, compare fast vs deep rating, and compare default fast rating against DeepSeek v4 Flash fast rating without writing results unless `--save` is provided.</w:t>
+      </w:r>
+    </w:p>
+    <w:p>
+      <w:pPr/>
+      <w:r>
+        <w:rPr>
+          <w:rFonts w:ascii="Helvetica Light" w:hAnsi="Helvetica Light" w:cs="Helvetica Light"/>
+          <w:sz w:val="24"/>
+          <w:sz-cs w:val="24"/>
+        </w:rPr>
         <w:t xml:space="preserve"/>
       </w:r>
     </w:p>
@@ -5312,6 +6588,39 @@
           <w:sz w:val="24"/>
           <w:sz-cs w:val="24"/>
         </w:rPr>
+        <w:t xml:space="preserve">9. Resume upload/removal and profile extraction preserve provenance and do not auto-spend LLM tokens.</w:t>
+      </w:r>
+    </w:p>
+    <w:p>
+      <w:pPr/>
+      <w:r>
+        <w:rPr>
+          <w:rFonts w:ascii="Helvetica Light" w:hAnsi="Helvetica Light" w:cs="Helvetica Light"/>
+          <w:sz w:val="24"/>
+          <w:sz-cs w:val="24"/>
+        </w:rPr>
+        <w:t xml:space="preserve">10. Deep ratings are cached by profile/job/rubric/model keys and shown on cards/detail pages.</w:t>
+      </w:r>
+    </w:p>
+    <w:p>
+      <w:pPr/>
+      <w:r>
+        <w:rPr>
+          <w:rFonts w:ascii="Helvetica Light" w:hAnsi="Helvetica Light" w:cs="Helvetica Light"/>
+          <w:sz w:val="24"/>
+          <w:sz-cs w:val="24"/>
+        </w:rPr>
+        <w:t xml:space="preserve">11. Fast/deep comparison commands report model names, threshold, confusion metrics, bucket counts, and false negatives.</w:t>
+      </w:r>
+    </w:p>
+    <w:p>
+      <w:pPr/>
+      <w:r>
+        <w:rPr>
+          <w:rFonts w:ascii="Helvetica Light" w:hAnsi="Helvetica Light" w:cs="Helvetica Light"/>
+          <w:sz w:val="24"/>
+          <w:sz-cs w:val="24"/>
+        </w:rPr>
         <w:t xml:space="preserve"/>
       </w:r>
     </w:p>
@@ -5345,7 +6654,29 @@
           <w:sz w:val="24"/>
           <w:sz-cs w:val="24"/>
         </w:rPr>
-        <w:t xml:space="preserve">- Add a scheduled refresh cron job.</w:t>
+        <w:t xml:space="preserve">Because the project is paused, these are optional restart items rather than active commitments:</w:t>
+      </w:r>
+    </w:p>
+    <w:p>
+      <w:pPr/>
+      <w:r>
+        <w:rPr>
+          <w:rFonts w:ascii="Helvetica Light" w:hAnsi="Helvetica Light" w:cs="Helvetica Light"/>
+          <w:sz w:val="24"/>
+          <w:sz-cs w:val="24"/>
+        </w:rPr>
+        <w:t xml:space="preserve"/>
+      </w:r>
+    </w:p>
+    <w:p>
+      <w:pPr/>
+      <w:r>
+        <w:rPr>
+          <w:rFonts w:ascii="Helvetica Light" w:hAnsi="Helvetica Light" w:cs="Helvetica Light"/>
+          <w:sz w:val="24"/>
+          <w:sz-cs w:val="24"/>
+        </w:rPr>
+        <w:t xml:space="preserve">- Add or maintain a scheduled refresh cron job.</w:t>
       </w:r>
     </w:p>
     <w:p>
@@ -5378,7 +6709,7 @@
           <w:sz w:val="24"/>
           <w:sz-cs w:val="24"/>
         </w:rPr>
-        <w:t xml:space="preserve">- Add scoring queue for Phase 1.</w:t>
+        <w:t xml:space="preserve">- Add persistent rating-attempt logs and richer stall diagnostics.</w:t>
       </w:r>
     </w:p>
     <w:p>

</xml_diff>

<commit_message>
docs: add fresh setup tutorial
</commit_message>
<xml_diff>
--- a/docs/brd/phase-0-job-sourcing.docx
+++ b/docs/brd/phase-0-job-sourcing.docx
@@ -285,6 +285,39 @@
           <w:sz w:val="24"/>
           <w:sz-cs w:val="24"/>
         </w:rPr>
+        <w:t xml:space="preserve">- `requirements.txt`: runtime dependencies for optional PDF resume extraction.</w:t>
+      </w:r>
+    </w:p>
+    <w:p>
+      <w:pPr/>
+      <w:r>
+        <w:rPr>
+          <w:rFonts w:ascii="Helvetica Light" w:hAnsi="Helvetica Light" w:cs="Helvetica Light"/>
+          <w:sz w:val="24"/>
+          <w:sz-cs w:val="24"/>
+        </w:rPr>
+        <w:t xml:space="preserve">- `requirements-dev.txt`: test/development dependencies.</w:t>
+      </w:r>
+    </w:p>
+    <w:p>
+      <w:pPr/>
+      <w:r>
+        <w:rPr>
+          <w:rFonts w:ascii="Helvetica Light" w:hAnsi="Helvetica Light" w:cs="Helvetica Light"/>
+          <w:sz w:val="24"/>
+          <w:sz-cs w:val="24"/>
+        </w:rPr>
+        <w:t xml:space="preserve">- `docs/setup-tutorial.md`: fresh-clone setup, local database initialization, optional LLM setup, optional scheduled refresh guidance, and Git/data boundary notes.</w:t>
+      </w:r>
+    </w:p>
+    <w:p>
+      <w:pPr/>
+      <w:r>
+        <w:rPr>
+          <w:rFonts w:ascii="Helvetica Light" w:hAnsi="Helvetica Light" w:cs="Helvetica Light"/>
+          <w:sz w:val="24"/>
+          <w:sz-cs w:val="24"/>
+        </w:rPr>
         <w:t xml:space="preserve">- `data/jobs.sqlite`: local SQLite database.</w:t>
       </w:r>
     </w:p>
@@ -319,6 +352,83 @@
           <w:sz-cs w:val="24"/>
         </w:rPr>
         <w:t xml:space="preserve">- `.env`: gitignored local secrets/config. `.env.example` documents required variables.</w:t>
+      </w:r>
+    </w:p>
+    <w:p>
+      <w:pPr/>
+      <w:r>
+        <w:rPr>
+          <w:rFonts w:ascii="Helvetica Light" w:hAnsi="Helvetica Light" w:cs="Helvetica Light"/>
+          <w:sz w:val="24"/>
+          <w:sz-cs w:val="24"/>
+        </w:rPr>
+        <w:t xml:space="preserve"/>
+      </w:r>
+    </w:p>
+    <w:p>
+      <w:pPr/>
+      <w:r>
+        <w:rPr>
+          <w:rFonts w:ascii="Helvetica Light" w:hAnsi="Helvetica Light" w:cs="Helvetica Light"/>
+          <w:sz w:val="24"/>
+          <w:sz-cs w:val="24"/>
+        </w:rPr>
+        <w:t xml:space="preserve">Distribution/setup notes:</w:t>
+      </w:r>
+    </w:p>
+    <w:p>
+      <w:pPr/>
+      <w:r>
+        <w:rPr>
+          <w:rFonts w:ascii="Helvetica Light" w:hAnsi="Helvetica Light" w:cs="Helvetica Light"/>
+          <w:sz w:val="24"/>
+          <w:sz-cs w:val="24"/>
+        </w:rPr>
+        <w:t xml:space="preserve"/>
+      </w:r>
+    </w:p>
+    <w:p>
+      <w:pPr/>
+      <w:r>
+        <w:rPr>
+          <w:rFonts w:ascii="Helvetica Light" w:hAnsi="Helvetica Light" w:cs="Helvetica Light"/>
+          <w:sz w:val="24"/>
+          <w:sz-cs w:val="24"/>
+        </w:rPr>
+        <w:t xml:space="preserve">- The Git repository intentionally does not include `data/`, local SQLite databases, uploaded resumes, raw snapshots, logs, or `.env` secrets.</w:t>
+      </w:r>
+    </w:p>
+    <w:p>
+      <w:pPr/>
+      <w:r>
+        <w:rPr>
+          <w:rFonts w:ascii="Helvetica Light" w:hAnsi="Helvetica Light" w:cs="Helvetica Light"/>
+          <w:sz w:val="24"/>
+          <w:sz-cs w:val="24"/>
+        </w:rPr>
+        <w:t xml:space="preserve">- A new clone must create its own Python environment, install `requirements.txt`, run `python -m jobsearch.app init-db`, and then run a refresh to populate `data/jobs.sqlite`.</w:t>
+      </w:r>
+    </w:p>
+    <w:p>
+      <w:pPr/>
+      <w:r>
+        <w:rPr>
+          <w:rFonts w:ascii="Helvetica Light" w:hAnsi="Helvetica Light" w:cs="Helvetica Light"/>
+          <w:sz w:val="24"/>
+          <w:sz-cs w:val="24"/>
+        </w:rPr>
+        <w:t xml:space="preserve">- LLM features require a user-owned OpenAI-compatible API key in local `.env` or the process environment.</w:t>
+      </w:r>
+    </w:p>
+    <w:p>
+      <w:pPr/>
+      <w:r>
+        <w:rPr>
+          <w:rFonts w:ascii="Helvetica Light" w:hAnsi="Helvetica Light" w:cs="Helvetica Light"/>
+          <w:sz w:val="24"/>
+          <w:sz-cs w:val="24"/>
+        </w:rPr>
+        <w:t xml:space="preserve">- Scheduled refreshes are external to the repository. The original local machine used a Hermes cron script outside the repo, but new clones do not get any automatic scheduler.</w:t>
       </w:r>
     </w:p>
     <w:p>

</xml_diff>